<commit_message>
Update gitbook 2025-10-28 22:10:36
</commit_message>
<xml_diff>
--- a/Heist/BoxAPuzzles.docx
+++ b/Heist/BoxAPuzzles.docx
@@ -6,14 +6,14 @@
       <w:pPr>
         <w:pStyle w:val="Title"/>
         <w:rPr>
-          <w:rFonts w:ascii="Director" w:hAnsi="Director"/>
-        </w:rPr>
-      </w:pPr>
-      <w:r>
-        <w:rPr>
-          <w:rFonts w:ascii="Director" w:hAnsi="Director"/>
-        </w:rPr>
-        <w:t>Box A Puzzles</w:t>
+          <w:rFonts w:ascii="Inter" w:hAnsi="Inter"/>
+        </w:rPr>
+      </w:pPr>
+      <w:r>
+        <w:rPr>
+          <w:rFonts w:ascii="Inter" w:hAnsi="Inter"/>
+        </w:rPr>
+        <w:t>UNLOCK BOX A</w:t>
       </w:r>
     </w:p>
     <w:p>
@@ -15085,6 +15085,7 @@
   <w:style w:type="character" w:default="1" w:styleId="DefaultParagraphFont">
     <w:name w:val="Default Paragraph Font"/>
     <w:uiPriority w:val="1"/>
+    <w:semiHidden/>
     <w:unhideWhenUsed/>
   </w:style>
   <w:style w:type="table" w:default="1" w:styleId="TableNormal">
@@ -16009,12 +16010,14 @@
 </file>
 
 <file path=customXml/item1.xml><?xml version="1.0" encoding="utf-8"?>
-<?mso-contentType ?>
-<FormTemplates xmlns="http://schemas.microsoft.com/sharepoint/v3/contenttype/forms">
-  <Display>DocumentLibraryForm</Display>
-  <Edit>DocumentLibraryForm</Edit>
-  <New>DocumentLibraryForm</New>
-</FormTemplates>
+<p:properties xmlns:p="http://schemas.microsoft.com/office/2006/metadata/properties" xmlns:xsi="http://www.w3.org/2001/XMLSchema-instance" xmlns:pc="http://schemas.microsoft.com/office/infopath/2007/PartnerControls">
+  <documentManagement>
+    <TaxCatchAll xmlns="85f25c69-f29c-4666-8734-2784a67134a3" xsi:nil="true"/>
+    <lcf76f155ced4ddcb4097134ff3c332f xmlns="192ce103-63e1-4bfc-a223-b437f4732470">
+      <Terms xmlns="http://schemas.microsoft.com/office/infopath/2007/PartnerControls"/>
+    </lcf76f155ced4ddcb4097134ff3c332f>
+  </documentManagement>
+</p:properties>
 </file>
 
 <file path=customXml/item2.xml><?xml version="1.0" encoding="utf-8"?>
@@ -16225,20 +16228,21 @@
 </file>
 
 <file path=customXml/item3.xml><?xml version="1.0" encoding="utf-8"?>
-<p:properties xmlns:p="http://schemas.microsoft.com/office/2006/metadata/properties" xmlns:xsi="http://www.w3.org/2001/XMLSchema-instance" xmlns:pc="http://schemas.microsoft.com/office/infopath/2007/PartnerControls">
-  <documentManagement>
-    <TaxCatchAll xmlns="85f25c69-f29c-4666-8734-2784a67134a3" xsi:nil="true"/>
-    <lcf76f155ced4ddcb4097134ff3c332f xmlns="192ce103-63e1-4bfc-a223-b437f4732470">
-      <Terms xmlns="http://schemas.microsoft.com/office/infopath/2007/PartnerControls"/>
-    </lcf76f155ced4ddcb4097134ff3c332f>
-  </documentManagement>
-</p:properties>
+<?mso-contentType ?>
+<FormTemplates xmlns="http://schemas.microsoft.com/sharepoint/v3/contenttype/forms">
+  <Display>DocumentLibraryForm</Display>
+  <Edit>DocumentLibraryForm</Edit>
+  <New>DocumentLibraryForm</New>
+</FormTemplates>
 </file>
 
 <file path=customXml/itemProps1.xml><?xml version="1.0" encoding="utf-8"?>
-<ds:datastoreItem xmlns:ds="http://schemas.openxmlformats.org/officeDocument/2006/customXml" ds:itemID="{77AFE7EB-9029-4016-9537-F0B1051730EB}">
+<ds:datastoreItem xmlns:ds="http://schemas.openxmlformats.org/officeDocument/2006/customXml" ds:itemID="{024A9B62-831D-42DB-B30F-000D9B96A89F}">
   <ds:schemaRefs>
-    <ds:schemaRef ds:uri="http://schemas.microsoft.com/sharepoint/v3/contenttype/forms"/>
+    <ds:schemaRef ds:uri="http://schemas.microsoft.com/office/2006/metadata/properties"/>
+    <ds:schemaRef ds:uri="http://schemas.microsoft.com/office/infopath/2007/PartnerControls"/>
+    <ds:schemaRef ds:uri="85f25c69-f29c-4666-8734-2784a67134a3"/>
+    <ds:schemaRef ds:uri="192ce103-63e1-4bfc-a223-b437f4732470"/>
   </ds:schemaRefs>
 </ds:datastoreItem>
 </file>
@@ -16263,12 +16267,9 @@
 </file>
 
 <file path=customXml/itemProps3.xml><?xml version="1.0" encoding="utf-8"?>
-<ds:datastoreItem xmlns:ds="http://schemas.openxmlformats.org/officeDocument/2006/customXml" ds:itemID="{024A9B62-831D-42DB-B30F-000D9B96A89F}">
+<ds:datastoreItem xmlns:ds="http://schemas.openxmlformats.org/officeDocument/2006/customXml" ds:itemID="{77AFE7EB-9029-4016-9537-F0B1051730EB}">
   <ds:schemaRefs>
-    <ds:schemaRef ds:uri="http://schemas.microsoft.com/office/2006/metadata/properties"/>
-    <ds:schemaRef ds:uri="http://schemas.microsoft.com/office/infopath/2007/PartnerControls"/>
-    <ds:schemaRef ds:uri="85f25c69-f29c-4666-8734-2784a67134a3"/>
-    <ds:schemaRef ds:uri="192ce103-63e1-4bfc-a223-b437f4732470"/>
+    <ds:schemaRef ds:uri="http://schemas.microsoft.com/sharepoint/v3/contenttype/forms"/>
   </ds:schemaRefs>
 </ds:datastoreItem>
 </file>
</xml_diff>